<commit_message>
docs(huong-dan): explain duplicate numbers and unapprovable requests
Co-Authored-By: Claude Opus 5 <noreply@anthropic.com>
</commit_message>
<xml_diff>
--- a/docs/huong-dan/duyet-de-nghi-sua/Huong-dan-duyet-de-nghi-sua.docx
+++ b/docs/huong-dan/duyet-de-nghi-sua/Huong-dan-duyet-de-nghi-sua.docx
@@ -726,7 +726,37 @@
         <w:t xml:space="preserve">Đơn vị · Nội dung · Ngày số liệu · Người gửi · Gửi lúc</w:t>
       </w:r>
       <w:r>
-        <w:t xml:space="preserve"> cho biết đề nghị đến từ đâu và cho bản ghi nào.</w:t>
+        <w:t xml:space="preserve"> cho biết đề nghị đến từ đâu và cho bản ghi nào. Cạnh Nội dung có thẻ </w:t>
+      </w:r>
+      <w:r>
+        <w:rPr>
+          <w:b/>
+          <w:bCs/>
+        </w:rPr>
+        <w:t xml:space="preserve">Thêm mới</w:t>
+      </w:r>
+      <w:r>
+        <w:t xml:space="preserve"> (đơn vị xin thêm một bản ghi chưa có), </w:t>
+      </w:r>
+      <w:r>
+        <w:rPr>
+          <w:b/>
+          <w:bCs/>
+        </w:rPr>
+        <w:t xml:space="preserve">Sửa</w:t>
+      </w:r>
+      <w:r>
+        <w:t xml:space="preserve"> hoặc </w:t>
+      </w:r>
+      <w:r>
+        <w:rPr>
+          <w:b/>
+          <w:bCs/>
+        </w:rPr>
+        <w:t xml:space="preserve">Xoá</w:t>
+      </w:r>
+      <w:r>
+        <w:t xml:space="preserve">.</w:t>
       </w:r>
     </w:p>
     <w:p>
@@ -855,6 +885,29 @@
       </w:r>
       <w:r>
         <w:t xml:space="preserve"> lấy lại bản mới nhất của đề nghị này.</w:t>
+      </w:r>
+    </w:p>
+    <w:p>
+      <w:pPr>
+        <w:pStyle w:val="ListParagraph"/>
+        <w:numPr>
+          <w:ilvl w:val="0"/>
+          <w:numId w:val="3"/>
+        </w:numPr>
+        <w:spacing w:after="80"/>
+      </w:pPr>
+      <w:r>
+        <w:t xml:space="preserve">Đề nghị </w:t>
+      </w:r>
+      <w:r>
+        <w:rPr>
+          <w:b/>
+          <w:bCs/>
+        </w:rPr>
+        <w:t xml:space="preserve">Thêm mới</w:t>
+      </w:r>
+      <w:r>
+        <w:t xml:space="preserve"> thì hai cột Lúc gửi và Hiện tại ở bảng bên dưới ghi “(chưa có)” — bản ghi chưa tồn tại, không phải ô bị xoá trắng.</w:t>
       </w:r>
     </w:p>
     <w:p>
@@ -1861,7 +1914,7 @@
         <w:spacing w:after="140"/>
       </w:pPr>
       <w:r>
-        <w:t xml:space="preserve">Bốn trường hợp thường gặp và cách xử lý.</w:t>
+        <w:t xml:space="preserve">Năm trường hợp thường gặp và cách xử lý.</w:t>
       </w:r>
     </w:p>
     <w:p>
@@ -2026,6 +2079,56 @@
       </w:r>
       <w:r>
         <w:t xml:space="preserve"> — trạng thái chuyển sang Đã huỷ, hai nút Duyệt và Từ chối không còn. Không phải làm gì thêm.</w:t>
+      </w:r>
+    </w:p>
+    <w:p>
+      <w:pPr>
+        <w:pStyle w:val="ListParagraph"/>
+        <w:numPr>
+          <w:ilvl w:val="0"/>
+          <w:numId w:val="10"/>
+        </w:numPr>
+        <w:spacing w:after="100"/>
+      </w:pPr>
+      <w:r>
+        <w:rPr>
+          <w:b/>
+          <w:bCs/>
+        </w:rPr>
+        <w:t xml:space="preserve">Đề nghị này không duyệt được</w:t>
+      </w:r>
+      <w:r>
+        <w:t xml:space="preserve"> — khung đỏ ở đầu trang, nút </w:t>
+      </w:r>
+      <w:r>
+        <w:rPr>
+          <w:b/>
+          <w:bCs/>
+        </w:rPr>
+        <w:t xml:space="preserve">Duyệt</w:t>
+      </w:r>
+      <w:r>
+        <w:t xml:space="preserve"> bị mờ. Nội dung đề nghị vi phạm quy định nhập liệu, hay gặp nhất là </w:t>
+      </w:r>
+      <w:r>
+        <w:rPr>
+          <w:b/>
+          <w:bCs/>
+        </w:rPr>
+        <w:t xml:space="preserve">trùng số</w:t>
+      </w:r>
+      <w:r>
+        <w:t xml:space="preserve">: đơn vị bấm Thêm rồi gõ lại số của một hợp đồng hoặc đợt giao đã có. Khung đỏ nêu bản ghi đang có (ngày giao, sản lượng). Bấm </w:t>
+      </w:r>
+      <w:r>
+        <w:rPr>
+          <w:b/>
+          <w:bCs/>
+        </w:rPr>
+        <w:t xml:space="preserve">Từ chối</w:t>
+      </w:r>
+      <w:r>
+        <w:t xml:space="preserve"> và ghi cách sửa, ví dụ “Đợt 2 đã có — gửi lại với số Đợt 3”.</w:t>
       </w:r>
     </w:p>
     <w:p>

</xml_diff>